<commit_message>
Redesign research management database schema
Replace the initial SQL schema with a MySQL-compatible research management schema covering projects, funding, publications, reviews, and equipment. Add integrity constraints and triggers, and update the assignment documents.
</commit_message>
<xml_diff>
--- a/Chapter One 1448/IT 641_Data Management and Governance/Assignment/472118102.docx
+++ b/Chapter One 1448/IT 641_Data Management and Governance/Assignment/472118102.docx
@@ -556,6 +556,97 @@
     </w:p>
     <w:p>
       <w:pPr>
+        <w:jc w:val="center"/>
+        <w:rPr>
+          <w:rFonts w:asciiTheme="majorBidi" w:hAnsiTheme="majorBidi" w:cstheme="majorBidi"/>
+          <w:bCs/>
+        </w:rPr>
+      </w:pPr>
+      <w:r>
+        <w:rPr>
+          <w:noProof/>
+        </w:rPr>
+        <w:drawing>
+          <wp:inline distT="0" distB="0" distL="0" distR="0" wp14:anchorId="4F6B3BD0" wp14:editId="6719523E">
+            <wp:extent cx="2836071" cy="3099679"/>
+            <wp:effectExtent l="0" t="0" r="2540" b="5715"/>
+            <wp:docPr id="1751650884" name="Picture 1"/>
+            <wp:cNvGraphicFramePr>
+              <a:graphicFrameLocks xmlns:a="http://schemas.openxmlformats.org/drawingml/2006/main" noChangeAspect="1"/>
+            </wp:cNvGraphicFramePr>
+            <a:graphic xmlns:a="http://schemas.openxmlformats.org/drawingml/2006/main">
+              <a:graphicData uri="http://schemas.openxmlformats.org/drawingml/2006/picture">
+                <pic:pic xmlns:pic="http://schemas.openxmlformats.org/drawingml/2006/picture">
+                  <pic:nvPicPr>
+                    <pic:cNvPr id="0" name="Picture 1"/>
+                    <pic:cNvPicPr>
+                      <a:picLocks noChangeAspect="1" noChangeArrowheads="1"/>
+                    </pic:cNvPicPr>
+                  </pic:nvPicPr>
+                  <pic:blipFill>
+                    <a:blip r:embed="rId8">
+                      <a:extLst>
+                        <a:ext uri="{28A0092B-C50C-407E-A947-70E740481C1C}">
+                          <a14:useLocalDpi xmlns:a14="http://schemas.microsoft.com/office/drawing/2010/main" val="0"/>
+                        </a:ext>
+                      </a:extLst>
+                    </a:blip>
+                    <a:srcRect/>
+                    <a:stretch>
+                      <a:fillRect/>
+                    </a:stretch>
+                  </pic:blipFill>
+                  <pic:spPr bwMode="auto">
+                    <a:xfrm>
+                      <a:off x="0" y="0"/>
+                      <a:ext cx="2849209" cy="3114038"/>
+                    </a:xfrm>
+                    <a:prstGeom prst="rect">
+                      <a:avLst/>
+                    </a:prstGeom>
+                    <a:noFill/>
+                    <a:ln>
+                      <a:noFill/>
+                    </a:ln>
+                  </pic:spPr>
+                </pic:pic>
+              </a:graphicData>
+            </a:graphic>
+          </wp:inline>
+        </w:drawing>
+      </w:r>
+    </w:p>
+    <w:p>
+      <w:pPr>
+        <w:jc w:val="center"/>
+        <w:rPr>
+          <w:rFonts w:asciiTheme="majorBidi" w:hAnsiTheme="majorBidi" w:cstheme="majorBidi"/>
+          <w:bCs/>
+          <w:i/>
+          <w:iCs/>
+        </w:rPr>
+      </w:pPr>
+      <w:r>
+        <w:rPr>
+          <w:rFonts w:asciiTheme="majorBidi" w:hAnsiTheme="majorBidi" w:cstheme="majorBidi"/>
+          <w:bCs/>
+          <w:i/>
+          <w:iCs/>
+        </w:rPr>
+        <w:t xml:space="preserve">Figure 1: </w:t>
+      </w:r>
+      <w:r>
+        <w:rPr>
+          <w:rFonts w:asciiTheme="majorBidi" w:hAnsiTheme="majorBidi" w:cstheme="majorBidi"/>
+          <w:bCs/>
+          <w:i/>
+          <w:iCs/>
+        </w:rPr>
+        <w:t>Military Model Enigma I, in use from 1930</w:t>
+      </w:r>
+    </w:p>
+    <w:p>
+      <w:pPr>
         <w:jc w:val="both"/>
         <w:rPr>
           <w:rFonts w:asciiTheme="majorBidi" w:hAnsiTheme="majorBidi" w:cstheme="majorBidi"/>
@@ -699,6 +790,7 @@
               <w:rPr>
                 <w:rFonts w:asciiTheme="majorBidi" w:hAnsiTheme="majorBidi" w:cstheme="majorBidi"/>
               </w:rPr>
+              <w:lastRenderedPageBreak/>
               <w:t>Component</w:t>
             </w:r>
           </w:p>
@@ -1037,7 +1129,6 @@
           <w:sz w:val="28"/>
           <w:szCs w:val="28"/>
         </w:rPr>
-        <w:lastRenderedPageBreak/>
         <w:t>How Germany used Enigma</w:t>
       </w:r>
     </w:p>
@@ -1304,15 +1395,6 @@
         <w:jc w:val="both"/>
         <w:rPr>
           <w:rFonts w:asciiTheme="majorBidi" w:hAnsiTheme="majorBidi" w:cstheme="majorBidi"/>
-          <w:bCs/>
-        </w:rPr>
-      </w:pPr>
-    </w:p>
-    <w:p>
-      <w:pPr>
-        <w:jc w:val="both"/>
-        <w:rPr>
-          <w:rFonts w:asciiTheme="majorBidi" w:hAnsiTheme="majorBidi" w:cstheme="majorBidi"/>
           <w:b/>
           <w:sz w:val="28"/>
           <w:szCs w:val="28"/>
@@ -1325,6 +1407,7 @@
           <w:sz w:val="28"/>
           <w:szCs w:val="28"/>
         </w:rPr>
+        <w:lastRenderedPageBreak/>
         <w:t>The weaknesses that enabled codebreaking to be achieved</w:t>
       </w:r>
     </w:p>
@@ -1614,7 +1697,6 @@
           <w:rFonts w:asciiTheme="majorBidi" w:hAnsiTheme="majorBidi" w:cstheme="majorBidi"/>
           <w:b/>
         </w:rPr>
-        <w:lastRenderedPageBreak/>
         <w:t>Captured material</w:t>
       </w:r>
       <w:r>
@@ -1942,15 +2024,6 @@
         <w:jc w:val="both"/>
         <w:rPr>
           <w:rFonts w:asciiTheme="majorBidi" w:hAnsiTheme="majorBidi" w:cstheme="majorBidi"/>
-          <w:bCs/>
-        </w:rPr>
-      </w:pPr>
-    </w:p>
-    <w:p>
-      <w:pPr>
-        <w:jc w:val="both"/>
-        <w:rPr>
-          <w:rFonts w:asciiTheme="majorBidi" w:hAnsiTheme="majorBidi" w:cstheme="majorBidi"/>
           <w:b/>
           <w:sz w:val="28"/>
           <w:szCs w:val="28"/>
@@ -1963,6 +2036,7 @@
           <w:sz w:val="28"/>
           <w:szCs w:val="28"/>
         </w:rPr>
+        <w:lastRenderedPageBreak/>
         <w:t>How Bletchley Park broke Enigma</w:t>
       </w:r>
     </w:p>
@@ -2158,7 +2232,6 @@
           <w:rFonts w:asciiTheme="majorBidi" w:hAnsiTheme="majorBidi" w:cstheme="majorBidi"/>
           <w:b/>
         </w:rPr>
-        <w:lastRenderedPageBreak/>
         <w:t>The diagonal board</w:t>
       </w:r>
       <w:r>
@@ -2559,6 +2632,7 @@
           <w:rFonts w:asciiTheme="majorBidi" w:hAnsiTheme="majorBidi" w:cstheme="majorBidi"/>
           <w:b/>
         </w:rPr>
+        <w:lastRenderedPageBreak/>
         <w:t>Other fronts</w:t>
       </w:r>
       <w:r>
@@ -2743,15 +2817,7 @@
           <w:rFonts w:asciiTheme="majorBidi" w:hAnsiTheme="majorBidi" w:cstheme="majorBidi"/>
           <w:bCs/>
         </w:rPr>
-        <w:t xml:space="preserve">Enigma was feared and trusted by Germany because it has a lot of settings but the machine itself and the way it was used gives out information. Poland got in mathematical ways and Britain made that into a working system of cribs, Bombes, captured material and statistical methods. The </w:t>
-      </w:r>
-      <w:r>
-        <w:rPr>
-          <w:rFonts w:asciiTheme="majorBidi" w:hAnsiTheme="majorBidi" w:cstheme="majorBidi"/>
-          <w:bCs/>
-        </w:rPr>
-        <w:lastRenderedPageBreak/>
-        <w:t xml:space="preserve">teaching point for cryptography is that a large </w:t>
+        <w:t xml:space="preserve">Enigma was feared and trusted by Germany because it has a lot of settings but the machine itself and the way it was used gives out information. Poland got in mathematical ways and Britain made that into a working system of cribs, Bombes, captured material and statistical methods. The teaching point for cryptography is that a large </w:t>
       </w:r>
       <w:r>
         <w:rPr>
@@ -3048,6 +3114,7 @@
         <w:rPr>
           <w:rFonts w:asciiTheme="majorBidi" w:hAnsiTheme="majorBidi" w:cstheme="majorBidi"/>
         </w:rPr>
+        <w:lastRenderedPageBreak/>
         <w:t xml:space="preserve">National Security Agency. (2014). </w:t>
       </w:r>
       <w:r>
@@ -3263,7 +3330,6 @@
         <w:rPr>
           <w:rFonts w:asciiTheme="majorBidi" w:hAnsiTheme="majorBidi" w:cstheme="majorBidi"/>
         </w:rPr>
-        <w:lastRenderedPageBreak/>
         <w:t xml:space="preserve">101 Computing. (n.d.). </w:t>
       </w:r>
       <w:r>
@@ -3622,20 +3688,12 @@
         </w:rPr>
         <w:t>. https://summify.io/discover/the-most-important-decryption-machine-ever-built-JsBZOc</w:t>
       </w:r>
-    </w:p>
-    <w:bookmarkEnd w:id="21"/>
-    <w:p>
-      <w:pPr>
-        <w:jc w:val="both"/>
-        <w:rPr>
-          <w:rFonts w:asciiTheme="majorBidi" w:hAnsiTheme="majorBidi" w:cstheme="majorBidi"/>
-        </w:rPr>
-      </w:pPr>
+      <w:bookmarkEnd w:id="21"/>
     </w:p>
     <w:sectPr>
-      <w:headerReference w:type="default" r:id="rId8"/>
-      <w:footerReference w:type="default" r:id="rId9"/>
-      <w:headerReference w:type="first" r:id="rId10"/>
+      <w:headerReference w:type="default" r:id="rId9"/>
+      <w:footerReference w:type="default" r:id="rId10"/>
+      <w:headerReference w:type="first" r:id="rId11"/>
       <w:pgSz w:w="12240" w:h="15840"/>
       <w:pgMar w:top="1440" w:right="1440" w:bottom="1440" w:left="1440" w:header="720" w:footer="720" w:gutter="0"/>
       <w:cols w:space="720"/>

</xml_diff>